<commit_message>
feat(main): add files by Stepik-1
</commit_message>
<xml_diff>
--- a/1/report/_output/report.docx
+++ b/1/report/_output/report.docx
@@ -7,7 +7,7 @@
         <w:pStyle w:val="Title"/>
       </w:pPr>
       <w:r>
-        <w:t xml:space="preserve">Отчёт по выполнению внешнего курса. Этап 1</w:t>
+        <w:t xml:space="preserve">Отчёт по выполнению внешнего курса на платформе Stepik. Этап 1</w:t>
       </w:r>
     </w:p>
     <w:p>
@@ -23,7 +23,7 @@
         <w:pStyle w:val="Author"/>
       </w:pPr>
       <w:r>
-        <w:t xml:space="preserve">Пономарева Варвара Александровна</w:t>
+        <w:t xml:space="preserve">Пыхтеева Маргарита Ивановна</w:t>
       </w:r>
     </w:p>
     <w:sdt>
@@ -114,7 +114,7 @@
       </w:r>
     </w:p>
     <w:bookmarkEnd w:id="21"/>
-    <w:bookmarkStart w:id="163" w:name="выполнение-внешнего-курса"/>
+    <w:bookmarkStart w:id="159" w:name="выполнение-внешнего-курса"/>
     <w:p>
       <w:pPr>
         <w:pStyle w:val="Heading1"/>
@@ -781,7 +781,7 @@
             <w:r>
               <w:drawing>
                 <wp:inline>
-                  <wp:extent cx="3733800" cy="1595136"/>
+                  <wp:extent cx="3733800" cy="1070235"/>
                   <wp:effectExtent b="0" l="0" r="0" t="0"/>
                   <wp:docPr descr="" title="" id="49" name="Picture"/>
                   <a:graphic>
@@ -802,7 +802,7 @@
                         <pic:spPr bwMode="auto">
                           <a:xfrm>
                             <a:off x="0" y="0"/>
-                            <a:ext cx="3733800" cy="1595136"/>
+                            <a:ext cx="3733800" cy="1070235"/>
                           </a:xfrm>
                           <a:prstGeom prst="rect">
                             <a:avLst/>
@@ -977,7 +977,7 @@
             <w:r>
               <w:drawing>
                 <wp:inline>
-                  <wp:extent cx="3733800" cy="603707"/>
+                  <wp:extent cx="3542339" cy="960504"/>
                   <wp:effectExtent b="0" l="0" r="0" t="0"/>
                   <wp:docPr descr="" title="" id="57" name="Picture"/>
                   <a:graphic>
@@ -998,7 +998,7 @@
                         <pic:spPr bwMode="auto">
                           <a:xfrm>
                             <a:off x="0" y="0"/>
-                            <a:ext cx="3733800" cy="603707"/>
+                            <a:ext cx="3542339" cy="960504"/>
                           </a:xfrm>
                           <a:prstGeom prst="rect">
                             <a:avLst/>
@@ -1075,7 +1075,7 @@
             <w:r>
               <w:drawing>
                 <wp:inline>
-                  <wp:extent cx="3733800" cy="1559688"/>
+                  <wp:extent cx="3733800" cy="954718"/>
                   <wp:effectExtent b="0" l="0" r="0" t="0"/>
                   <wp:docPr descr="" title="" id="61" name="Picture"/>
                   <a:graphic>
@@ -1096,7 +1096,7 @@
                         <pic:spPr bwMode="auto">
                           <a:xfrm>
                             <a:off x="0" y="0"/>
-                            <a:ext cx="3733800" cy="1559688"/>
+                            <a:ext cx="3733800" cy="954718"/>
                           </a:xfrm>
                           <a:prstGeom prst="rect">
                             <a:avLst/>
@@ -1281,7 +1281,7 @@
             <w:r>
               <w:drawing>
                 <wp:inline>
-                  <wp:extent cx="3733800" cy="1702101"/>
+                  <wp:extent cx="3733800" cy="1461052"/>
                   <wp:effectExtent b="0" l="0" r="0" t="0"/>
                   <wp:docPr descr="" title="" id="70" name="Picture"/>
                   <a:graphic>
@@ -1302,7 +1302,7 @@
                         <pic:spPr bwMode="auto">
                           <a:xfrm>
                             <a:off x="0" y="0"/>
-                            <a:ext cx="3733800" cy="1702101"/>
+                            <a:ext cx="3733800" cy="1461052"/>
                           </a:xfrm>
                           <a:prstGeom prst="rect">
                             <a:avLst/>
@@ -1379,7 +1379,7 @@
             <w:r>
               <w:drawing>
                 <wp:inline>
-                  <wp:extent cx="3733800" cy="1794423"/>
+                  <wp:extent cx="3733800" cy="1557009"/>
                   <wp:effectExtent b="0" l="0" r="0" t="0"/>
                   <wp:docPr descr="" title="" id="74" name="Picture"/>
                   <a:graphic>
@@ -1400,7 +1400,7 @@
                         <pic:spPr bwMode="auto">
                           <a:xfrm>
                             <a:off x="0" y="0"/>
-                            <a:ext cx="3733800" cy="1794423"/>
+                            <a:ext cx="3733800" cy="1557009"/>
                           </a:xfrm>
                           <a:prstGeom prst="rect">
                             <a:avLst/>
@@ -1673,7 +1673,7 @@
             <w:r>
               <w:drawing>
                 <wp:inline>
-                  <wp:extent cx="3733800" cy="1871891"/>
+                  <wp:extent cx="3733800" cy="1672223"/>
                   <wp:effectExtent b="0" l="0" r="0" t="0"/>
                   <wp:docPr descr="" title="" id="86" name="Picture"/>
                   <a:graphic>
@@ -1694,7 +1694,7 @@
                         <pic:spPr bwMode="auto">
                           <a:xfrm>
                             <a:off x="0" y="0"/>
-                            <a:ext cx="3733800" cy="1871891"/>
+                            <a:ext cx="3733800" cy="1672223"/>
                           </a:xfrm>
                           <a:prstGeom prst="rect">
                             <a:avLst/>
@@ -1781,7 +1781,7 @@
             <w:r>
               <w:drawing>
                 <wp:inline>
-                  <wp:extent cx="3733800" cy="1680210"/>
+                  <wp:extent cx="3733800" cy="1493520"/>
                   <wp:effectExtent b="0" l="0" r="0" t="0"/>
                   <wp:docPr descr="" title="" id="91" name="Picture"/>
                   <a:graphic>
@@ -1802,7 +1802,7 @@
                         <pic:spPr bwMode="auto">
                           <a:xfrm>
                             <a:off x="0" y="0"/>
-                            <a:ext cx="3733800" cy="1680210"/>
+                            <a:ext cx="3733800" cy="1493520"/>
                           </a:xfrm>
                           <a:prstGeom prst="rect">
                             <a:avLst/>
@@ -1977,7 +1977,7 @@
             <w:r>
               <w:drawing>
                 <wp:inline>
-                  <wp:extent cx="3733800" cy="1232516"/>
+                  <wp:extent cx="3173505" cy="468726"/>
                   <wp:effectExtent b="0" l="0" r="0" t="0"/>
                   <wp:docPr descr="" title="" id="99" name="Picture"/>
                   <a:graphic>
@@ -1998,7 +1998,7 @@
                         <pic:spPr bwMode="auto">
                           <a:xfrm>
                             <a:off x="0" y="0"/>
-                            <a:ext cx="3733800" cy="1232516"/>
+                            <a:ext cx="3173505" cy="468726"/>
                           </a:xfrm>
                           <a:prstGeom prst="rect">
                             <a:avLst/>
@@ -2075,7 +2075,7 @@
             <w:r>
               <w:drawing>
                 <wp:inline>
-                  <wp:extent cx="3733800" cy="2273583"/>
+                  <wp:extent cx="3733800" cy="1602772"/>
                   <wp:effectExtent b="0" l="0" r="0" t="0"/>
                   <wp:docPr descr="" title="" id="103" name="Picture"/>
                   <a:graphic>
@@ -2096,7 +2096,7 @@
                         <pic:spPr bwMode="auto">
                           <a:xfrm>
                             <a:off x="0" y="0"/>
-                            <a:ext cx="3733800" cy="2273583"/>
+                            <a:ext cx="3733800" cy="1602772"/>
                           </a:xfrm>
                           <a:prstGeom prst="rect">
                             <a:avLst/>
@@ -2183,7 +2183,7 @@
             <w:r>
               <w:drawing>
                 <wp:inline>
-                  <wp:extent cx="3733800" cy="1889513"/>
+                  <wp:extent cx="3733800" cy="1698552"/>
                   <wp:effectExtent b="0" l="0" r="0" t="0"/>
                   <wp:docPr descr="" title="" id="108" name="Picture"/>
                   <a:graphic>
@@ -2204,7 +2204,7 @@
                         <pic:spPr bwMode="auto">
                           <a:xfrm>
                             <a:off x="0" y="0"/>
-                            <a:ext cx="3733800" cy="1889513"/>
+                            <a:ext cx="3733800" cy="1698552"/>
                           </a:xfrm>
                           <a:prstGeom prst="rect">
                             <a:avLst/>
@@ -2379,7 +2379,7 @@
             <w:r>
               <w:drawing>
                 <wp:inline>
-                  <wp:extent cx="3733800" cy="2222732"/>
+                  <wp:extent cx="3733800" cy="2079455"/>
                   <wp:effectExtent b="0" l="0" r="0" t="0"/>
                   <wp:docPr descr="" title="" id="116" name="Picture"/>
                   <a:graphic>
@@ -2400,7 +2400,7 @@
                         <pic:spPr bwMode="auto">
                           <a:xfrm>
                             <a:off x="0" y="0"/>
-                            <a:ext cx="3733800" cy="2222732"/>
+                            <a:ext cx="3733800" cy="2079455"/>
                           </a:xfrm>
                           <a:prstGeom prst="rect">
                             <a:avLst/>
@@ -2487,7 +2487,7 @@
             <w:r>
               <w:drawing>
                 <wp:inline>
-                  <wp:extent cx="3733800" cy="2067189"/>
+                  <wp:extent cx="3733800" cy="1849590"/>
                   <wp:effectExtent b="0" l="0" r="0" t="0"/>
                   <wp:docPr descr="" title="" id="121" name="Picture"/>
                   <a:graphic>
@@ -2508,7 +2508,7 @@
                         <pic:spPr bwMode="auto">
                           <a:xfrm>
                             <a:off x="0" y="0"/>
-                            <a:ext cx="3733800" cy="2067189"/>
+                            <a:ext cx="3733800" cy="1849590"/>
                           </a:xfrm>
                           <a:prstGeom prst="rect">
                             <a:avLst/>
@@ -2585,7 +2585,7 @@
             <w:r>
               <w:drawing>
                 <wp:inline>
-                  <wp:extent cx="3733800" cy="2142344"/>
+                  <wp:extent cx="3733800" cy="1948513"/>
                   <wp:effectExtent b="0" l="0" r="0" t="0"/>
                   <wp:docPr descr="" title="" id="125" name="Picture"/>
                   <a:graphic>
@@ -2606,7 +2606,7 @@
                         <pic:spPr bwMode="auto">
                           <a:xfrm>
                             <a:off x="0" y="0"/>
-                            <a:ext cx="3733800" cy="2142344"/>
+                            <a:ext cx="3733800" cy="1948513"/>
                           </a:xfrm>
                           <a:prstGeom prst="rect">
                             <a:avLst/>
@@ -2683,7 +2683,7 @@
             <w:r>
               <w:drawing>
                 <wp:inline>
-                  <wp:extent cx="3733800" cy="1688501"/>
+                  <wp:extent cx="3733800" cy="1447287"/>
                   <wp:effectExtent b="0" l="0" r="0" t="0"/>
                   <wp:docPr descr="" title="" id="129" name="Picture"/>
                   <a:graphic>
@@ -2704,7 +2704,7 @@
                         <pic:spPr bwMode="auto">
                           <a:xfrm>
                             <a:off x="0" y="0"/>
-                            <a:ext cx="3733800" cy="1688501"/>
+                            <a:ext cx="3733800" cy="1447287"/>
                           </a:xfrm>
                           <a:prstGeom prst="rect">
                             <a:avLst/>
@@ -2791,7 +2791,7 @@
             <w:r>
               <w:drawing>
                 <wp:inline>
-                  <wp:extent cx="3733800" cy="2163233"/>
+                  <wp:extent cx="3733800" cy="1876777"/>
                   <wp:effectExtent b="0" l="0" r="0" t="0"/>
                   <wp:docPr descr="" title="" id="134" name="Picture"/>
                   <a:graphic>
@@ -2812,7 +2812,7 @@
                         <pic:spPr bwMode="auto">
                           <a:xfrm>
                             <a:off x="0" y="0"/>
-                            <a:ext cx="3733800" cy="2163233"/>
+                            <a:ext cx="3733800" cy="1876777"/>
                           </a:xfrm>
                           <a:prstGeom prst="rect">
                             <a:avLst/>
@@ -2889,7 +2889,7 @@
             <w:r>
               <w:drawing>
                 <wp:inline>
-                  <wp:extent cx="3733800" cy="2140104"/>
+                  <wp:extent cx="3733800" cy="1947849"/>
                   <wp:effectExtent b="0" l="0" r="0" t="0"/>
                   <wp:docPr descr="" title="" id="138" name="Picture"/>
                   <a:graphic>
@@ -2910,7 +2910,7 @@
                         <pic:spPr bwMode="auto">
                           <a:xfrm>
                             <a:off x="0" y="0"/>
-                            <a:ext cx="3733800" cy="2140104"/>
+                            <a:ext cx="3733800" cy="1947849"/>
                           </a:xfrm>
                           <a:prstGeom prst="rect">
                             <a:avLst/>
@@ -2987,7 +2987,7 @@
             <w:r>
               <w:drawing>
                 <wp:inline>
-                  <wp:extent cx="3733800" cy="1791823"/>
+                  <wp:extent cx="3733800" cy="1556584"/>
                   <wp:effectExtent b="0" l="0" r="0" t="0"/>
                   <wp:docPr descr="" title="" id="142" name="Picture"/>
                   <a:graphic>
@@ -3008,7 +3008,7 @@
                         <pic:spPr bwMode="auto">
                           <a:xfrm>
                             <a:off x="0" y="0"/>
-                            <a:ext cx="3733800" cy="1791823"/>
+                            <a:ext cx="3733800" cy="1556584"/>
                           </a:xfrm>
                           <a:prstGeom prst="rect">
                             <a:avLst/>
@@ -3045,7 +3045,7 @@
       </w:tr>
     </w:tbl>
     <w:bookmarkEnd w:id="145"/>
-    <w:bookmarkStart w:id="162" w:name="поиск-файлов-и-слов-в-файлах"/>
+    <w:bookmarkStart w:id="158" w:name="поиск-файлов-и-слов-в-файлах"/>
     <w:p>
       <w:pPr>
         <w:pStyle w:val="Heading2"/>
@@ -3267,7 +3267,7 @@
             <w:r>
               <w:drawing>
                 <wp:inline>
-                  <wp:extent cx="3733800" cy="2301522"/>
+                  <wp:extent cx="3733800" cy="2148416"/>
                   <wp:effectExtent b="0" l="0" r="0" t="0"/>
                   <wp:docPr descr="" title="" id="151" name="Picture"/>
                   <a:graphic>
@@ -3288,7 +3288,7 @@
                         <pic:spPr bwMode="auto">
                           <a:xfrm>
                             <a:off x="0" y="0"/>
-                            <a:ext cx="3733800" cy="2301522"/>
+                            <a:ext cx="3733800" cy="2148416"/>
                           </a:xfrm>
                           <a:prstGeom prst="rect">
                             <a:avLst/>
@@ -3341,7 +3341,7 @@
         <w:t xml:space="preserve"> </w:t>
       </w:r>
       <w:r>
-        <w:t xml:space="preserve">(</w:t>
+        <w:t xml:space="preserve">и загружаю этот файл на платформу.(</w:t>
       </w:r>
       <w:hyperlink w:anchor="fig-032">
         <w:r>
@@ -3377,7 +3377,7 @@
             <w:r>
               <w:drawing>
                 <wp:inline>
-                  <wp:extent cx="3733800" cy="4256532"/>
+                  <wp:extent cx="3733800" cy="383972"/>
                   <wp:effectExtent b="0" l="0" r="0" t="0"/>
                   <wp:docPr descr="" title="" id="155" name="Picture"/>
                   <a:graphic>
@@ -3398,7 +3398,7 @@
                         <pic:spPr bwMode="auto">
                           <a:xfrm>
                             <a:off x="0" y="0"/>
-                            <a:ext cx="3733800" cy="4256532"/>
+                            <a:ext cx="3733800" cy="383972"/>
                           </a:xfrm>
                           <a:prstGeom prst="rect">
                             <a:avLst/>
@@ -3434,107 +3434,9 @@
         </w:tc>
       </w:tr>
     </w:tbl>
-    <w:p>
-      <w:pPr>
-        <w:pStyle w:val="BodyText"/>
-      </w:pPr>
-      <w:r>
-        <w:t xml:space="preserve">Загружаю этот файл на платформу. (</w:t>
-      </w:r>
-      <w:hyperlink w:anchor="fig-033">
-        <w:r>
-          <w:rPr>
-            <w:rStyle w:val="Hyperlink"/>
-          </w:rPr>
-          <w:t xml:space="preserve">рис. 33</w:t>
-        </w:r>
-      </w:hyperlink>
-      <w:r>
-        <w:t xml:space="preserve">).</w:t>
-      </w:r>
-    </w:p>
-    <w:tbl>
-      <w:tblPr>
-        <w:tblStyle w:val="Table"/>
-        <w:tblW w:type="pct" w:w="5000"/>
-        <w:tblLayout w:type="fixed"/>
-        <w:tblLook w:firstRow="0" w:lastRow="0" w:firstColumn="0" w:lastColumn="0" w:noHBand="0" w:noVBand="0" w:val="0000"/>
-      </w:tblPr>
-      <w:tblGrid>
-        <w:gridCol w:w="7920"/>
-      </w:tblGrid>
-      <w:tr>
-        <w:tc>
-          <w:tcPr/>
-          <w:bookmarkStart w:id="161" w:name="fig-033"/>
-          <w:p>
-            <w:pPr>
-              <w:pStyle w:val="Compact"/>
-              <w:jc w:val="center"/>
-            </w:pPr>
-            <w:r>
-              <w:drawing>
-                <wp:inline>
-                  <wp:extent cx="3733800" cy="2781359"/>
-                  <wp:effectExtent b="0" l="0" r="0" t="0"/>
-                  <wp:docPr descr="" title="" id="159" name="Picture"/>
-                  <a:graphic>
-                    <a:graphicData uri="http://schemas.openxmlformats.org/drawingml/2006/picture">
-                      <pic:pic>
-                        <pic:nvPicPr>
-                          <pic:cNvPr descr="image/33.png" id="160" name="Picture"/>
-                          <pic:cNvPicPr>
-                            <a:picLocks noChangeArrowheads="1" noChangeAspect="1"/>
-                          </pic:cNvPicPr>
-                        </pic:nvPicPr>
-                        <pic:blipFill>
-                          <a:blip r:embed="rId158"/>
-                          <a:stretch>
-                            <a:fillRect/>
-                          </a:stretch>
-                        </pic:blipFill>
-                        <pic:spPr bwMode="auto">
-                          <a:xfrm>
-                            <a:off x="0" y="0"/>
-                            <a:ext cx="3733800" cy="2781359"/>
-                          </a:xfrm>
-                          <a:prstGeom prst="rect">
-                            <a:avLst/>
-                          </a:prstGeom>
-                          <a:noFill/>
-                          <a:ln w="9525">
-                            <a:noFill/>
-                            <a:headEnd/>
-                            <a:tailEnd/>
-                          </a:ln>
-                        </pic:spPr>
-                      </pic:pic>
-                    </a:graphicData>
-                  </a:graphic>
-                </wp:inline>
-              </w:drawing>
-            </w:r>
-          </w:p>
-          <w:p>
-            <w:pPr>
-              <w:jc w:val="center"/>
-            </w:pPr>
-            <w:pPr>
-              <w:jc w:val="start"/>
-              <w:spacing w:before="200"/>
-              <w:pStyle w:val="ImageCaption"/>
-            </w:pPr>
-            <w:r>
-              <w:t xml:space="preserve">Рисунок 33: Задание 29</w:t>
-            </w:r>
-          </w:p>
-          <w:bookmarkEnd w:id="161"/>
-        </w:tc>
-      </w:tr>
-    </w:tbl>
-    <w:bookmarkEnd w:id="162"/>
-    <w:bookmarkEnd w:id="163"/>
-    <w:bookmarkStart w:id="164" w:name="выводы"/>
+    <w:bookmarkEnd w:id="158"/>
+    <w:bookmarkEnd w:id="159"/>
+    <w:bookmarkStart w:id="160" w:name="выводы"/>
     <w:p>
       <w:pPr>
         <w:pStyle w:val="Heading1"/>
@@ -3551,7 +3453,7 @@
         <w:t xml:space="preserve">Мы освоили базовые функции Linux и выполнили задания.</w:t>
       </w:r>
     </w:p>
-    <w:bookmarkEnd w:id="164"/>
+    <w:bookmarkEnd w:id="160"/>
     <w:sectPr>
       <w:footnotePr>
         <w:numRestart w:val="eachSect"/>

</xml_diff>